<commit_message>
docs(auth): define institutional access requirements
</commit_message>
<xml_diff>
--- a/docs/specs/Germinatura_Especificacao_Funcional_Tecnica_v2.2.docx
+++ b/docs/specs/Germinatura_Especificacao_Funcional_Tecnica_v2.2.docx
@@ -158,7 +158,7 @@
           </w:tcPr>
           <w:p>
             <w:r>
-              <w:t>2.2 - especificação-alvo revisada</w:t>
+              <w:t>2.2 - especificação-alvo com revisão de acesso institucional</w:t>
             </w:r>
           </w:p>
         </w:tc>
@@ -200,7 +200,7 @@
           </w:tcPr>
           <w:p>
             <w:r>
-              <w:t>25/08/2026</w:t>
+              <w:t>30/08/2026</w:t>
             </w:r>
           </w:p>
         </w:tc>
@@ -775,6 +775,48 @@
           </w:p>
         </w:tc>
       </w:tr>
+      <w:tr>
+        <w:tc>
+          <w:tcPr>
+            <w:tcW w:type="dxa" w:w="2541"/>
+          </w:tcPr>
+          <w:p>
+            <w:r>
+              <w:t>2.2.1</w:t>
+            </w:r>
+          </w:p>
+        </w:tc>
+        <w:tc>
+          <w:tcPr>
+            <w:tcW w:type="dxa" w:w="2541"/>
+          </w:tcPr>
+          <w:p>
+            <w:r>
+              <w:t>30/08/2026</w:t>
+            </w:r>
+          </w:p>
+        </w:tc>
+        <w:tc>
+          <w:tcPr>
+            <w:tcW w:type="dxa" w:w="2541"/>
+          </w:tcPr>
+          <w:p>
+            <w:r>
+              <w:t>Acesso institucional</w:t>
+            </w:r>
+          </w:p>
+        </w:tc>
+        <w:tc>
+          <w:tcPr>
+            <w:tcW w:type="dxa" w:w="2541"/>
+          </w:tcPr>
+          <w:p>
+            <w:r>
+              <w:t>Define ingresso no Portal por código enviado ao domínio institutojef.org.br, papéis cumulativos, ativação administrativa do vendedor e bootstrap seguro do primeiro administrador.</w:t>
+            </w:r>
+          </w:p>
+        </w:tc>
+      </w:tr>
     </w:tbl>
     <w:p>
       <w:pPr>
@@ -1399,13 +1441,13 @@
         <w:br/>
         <w:t>├── Eventos e campanhas</w:t>
         <w:br/>
-        <w:t>├── Comunidade / Mural</w:t>
+        <w:t>├── Rede Social Germinare / Mural</w:t>
         <w:br/>
         <w:t>├── Notificações</w:t>
         <w:br/>
         <w:t>├── Minha conta</w:t>
         <w:br/>
-        <w:t>├── Entrar / Cadastro</w:t>
+        <w:t>├── Entrar com código institucional / Cadastro</w:t>
         <w:br/>
         <w:t>├── Abrir PDV (quando autorizado)</w:t>
         <w:br/>
@@ -1437,7 +1479,7 @@
         <w:br/>
         <w:t xml:space="preserve">    ├── Comunicação e divulgação</w:t>
         <w:br/>
-        <w:t xml:space="preserve">    ├── Comunidade / Moderação</w:t>
+        <w:t xml:space="preserve">    ├── Rede Social Germinare / Moderação</w:t>
         <w:br/>
         <w:t xml:space="preserve">    ├── Notificações</w:t>
         <w:br/>
@@ -1963,6 +2005,38 @@
     </w:p>
     <w:p>
       <w:pPr>
+        <w:pStyle w:val="ListBullet"/>
+      </w:pPr>
+      <w:r>
+        <w:t>Qualquer pessoa que comprove controle de um endereço no domínio exato @institutojef.org.br poderá autenticar-se no Portal por código de uso único enviado ao próprio e-mail; domínios externos, subdomínios e grafias semelhantes serão rejeitados.</w:t>
+      </w:r>
+    </w:p>
+    <w:p>
+      <w:pPr>
+        <w:pStyle w:val="ListBullet"/>
+      </w:pPr>
+      <w:r>
+        <w:t>A primeira autenticação institucional válida concede somente o papel base CONSUMIDOR. A mesma identidade poderá acumular outros papéis, sem duplicação de conta.</w:t>
+      </w:r>
+    </w:p>
+    <w:p>
+      <w:pPr>
+        <w:pStyle w:val="ListBullet"/>
+      </w:pPr>
+      <w:r>
+        <w:t>O domínio institucional, isoladamente, não concede acesso ao PDV. O papel VENDEDOR e a permissão de venda presencial exigem ativação explícita e auditada por administrador.</w:t>
+      </w:r>
+    </w:p>
+    <w:p>
+      <w:pPr>
+        <w:pStyle w:val="ListBullet"/>
+      </w:pPr>
+      <w:r>
+        <w:t>O bootstrap greenfield define theo.martins@institutojef.org.br como primeiro administrador, após verificação do endereço, por operação única, idempotente e auditada, sem senha, código ou segredo versionado.</w:t>
+      </w:r>
+    </w:p>
+    <w:p>
+      <w:pPr>
         <w:pStyle w:val="Heading2"/>
         <w:widowControl/>
         <w:keepNext/>
@@ -2855,15 +2929,15 @@
         <w:keepNext/>
       </w:pPr>
       <w:r>
-        <w:t>4.6 Aba Comunidade / Mural</w:t>
-      </w:r>
-    </w:p>
-    <w:p>
-      <w:pPr>
-        <w:widowControl/>
-      </w:pPr>
-      <w:r>
-        <w:t>A primeira versão deve ser um mural moderado, e não um chat aberto. Isso reduz complexidade, spam e risco de moderação. Chats simultâneos poderão ser adicionados em fase posterior se houver uso comprovado.</w:t>
+        <w:t>4.6 Aba Rede Social Germinare / Mural</w:t>
+      </w:r>
+    </w:p>
+    <w:p>
+      <w:pPr>
+        <w:widowControl/>
+      </w:pPr>
+      <w:r>
+        <w:t>A Rede Social Germinare deve começar como um mural moderado, e não um chat aberto. Isso reduz complexidade, spam e risco de moderação. Chats simultâneos poderão ser adicionados em fase posterior se houver uso comprovado.</w:t>
       </w:r>
     </w:p>
     <w:p>
@@ -2948,6 +3022,14 @@
     </w:p>
     <w:p>
       <w:pPr>
+        <w:pStyle w:val="ListBullet"/>
+      </w:pPr>
+      <w:r>
+        <w:t>A Rede Social Germinare e as demais funcionalidades autenticadas do Portal estarão disponíveis a identidades verificadas do domínio @institutojef.org.br, respeitando flags, moderação e permissões específicas.</w:t>
+      </w:r>
+    </w:p>
+    <w:p>
+      <w:pPr>
         <w:pStyle w:val="Heading3"/>
         <w:widowControl/>
         <w:keepNext/>
@@ -3064,6 +3146,22 @@
       </w:pPr>
       <w:r>
         <w:t>Para vendedor: atalho para PDV e visão de responsabilidades pendentes.</w:t>
+      </w:r>
+    </w:p>
+    <w:p>
+      <w:pPr>
+        <w:pStyle w:val="ListBullet"/>
+      </w:pPr>
+      <w:r>
+        <w:t>Entrada e cadastro por código de uso único enviado ao e-mail institucional @institutojef.org.br; o código deve expirar, ser de uso único e não pode ser registrado em logs.</w:t>
+      </w:r>
+    </w:p>
+    <w:p>
+      <w:pPr>
+        <w:pStyle w:val="ListBullet"/>
+      </w:pPr>
+      <w:r>
+        <w:t>Uma conta exibe seus papéis cumulativos, mas o atalho do PDV somente aparece quando VENDEDOR e a permissão aplicável estiverem ativos.</w:t>
       </w:r>
     </w:p>
     <w:p>
@@ -5652,6 +5750,22 @@
     </w:p>
     <w:p>
       <w:pPr>
+        <w:pStyle w:val="ListBullet"/>
+      </w:pPr>
+      <w:r>
+        <w:t>Ativação e remoção do papel VENDEDOR devem ser ações administrativas explícitas, com confirmação das consequências e registro em audit log.</w:t>
+      </w:r>
+    </w:p>
+    <w:p>
+      <w:pPr>
+        <w:pStyle w:val="ListBullet"/>
+      </w:pPr>
+      <w:r>
+        <w:t>O primeiro ADMIN é reservado a theo.martins@institutojef.org.br por bootstrap único; depois da primeira concessão válida, novos administradores seguem exclusivamente o fluxo normal de permissões.</w:t>
+      </w:r>
+    </w:p>
+    <w:p>
+      <w:pPr>
         <w:pStyle w:val="Heading3"/>
         <w:widowControl/>
         <w:keepNext/>
@@ -5735,7 +5849,7 @@
         <w:keepNext/>
       </w:pPr>
       <w:r>
-        <w:t>5.14 Comunidade / Moderação</w:t>
+        <w:t>5.14 Rede Social Germinare / Moderação</w:t>
       </w:r>
     </w:p>
     <w:p>
@@ -6038,6 +6152,14 @@
       </w:pPr>
       <w:r>
         <w:t>A identidade operacional do vendedor no Germinatura é separada da identidade financeira do PicPay. Conta, KYC e credenciais do PicPay Empresas pertencem ao CNPJ e ao representante legal adulto; vendedores não recebem credenciais financeiras. O PicPay Tap, quando usado, respeita as permissões do aplicativo e não será tratado como solução distribuída para todos os vendedores enquanto estiver restrito ao usuário principal.</w:t>
+      </w:r>
+    </w:p>
+    <w:p>
+      <w:pPr>
+        <w:pStyle w:val="ListBullet"/>
+      </w:pPr>
+      <w:r>
+        <w:t>Possuir e verificar um e-mail @institutojef.org.br habilita somente o Portal como CONSUMIDOR. O PDV deve continuar negando acesso direto à interface e às APIs até que um administrador ative VENDEDOR e a permissão de venda presencial para a mesma identidade.</w:t>
       </w:r>
     </w:p>
     <w:p>
@@ -11993,6 +12115,30 @@
     </w:p>
     <w:p>
       <w:pPr>
+        <w:pStyle w:val="ListBullet"/>
+      </w:pPr>
+      <w:r>
+        <w:t>O ingresso institucional usa código de uso único enviado ao endereço verificado do domínio canônico institutojef.org.br. A comparação deve usar o e-mail normalizado informado pelo provedor, nunca apenas validação visual no cliente ou correspondência insegura por sufixo.</w:t>
+      </w:r>
+    </w:p>
+    <w:p>
+      <w:pPr>
+        <w:pStyle w:val="ListBullet"/>
+      </w:pPr>
+      <w:r>
+        <w:t>Solicitação e validação de código devem ter expiração, proteção contra replay, rate limit e respostas que não facilitem enumeração de contas.</w:t>
+      </w:r>
+    </w:p>
+    <w:p>
+      <w:pPr>
+        <w:pStyle w:val="ListBullet"/>
+      </w:pPr>
+      <w:r>
+        <w:t>Código de verificação, token e segredo nunca são persistidos em texto claro na aplicação, expostos em resposta ou registrados em log/auditoria.</w:t>
+      </w:r>
+    </w:p>
+    <w:p>
+      <w:pPr>
         <w:pStyle w:val="Heading3"/>
         <w:widowControl/>
         <w:keepNext/>
@@ -12049,6 +12195,22 @@
       </w:pPr>
       <w:r>
         <w:t>Princípio de menor privilégio.</w:t>
+      </w:r>
+    </w:p>
+    <w:p>
+      <w:pPr>
+        <w:pStyle w:val="ListBullet"/>
+      </w:pPr>
+      <w:r>
+        <w:t>A conta institucional recebe somente CONSUMIDOR por padrão e pode acumular papéis; toda elevação, inclusive VENDEDOR e ADMIN, é verificada no servidor, registrada e revogável.</w:t>
+      </w:r>
+    </w:p>
+    <w:p>
+      <w:pPr>
+        <w:pStyle w:val="ListBullet"/>
+      </w:pPr>
+      <w:r>
+        <w:t>O bootstrap de theo.martins@institutojef.org.br deve exigir endereço verificado, ser idempotente e tornar-se indisponível após a primeira concessão administrativa válida.</w:t>
       </w:r>
     </w:p>
     <w:p>
@@ -15493,7 +15655,7 @@
               <w:rPr>
                 <w:sz w:val="16"/>
               </w:rPr>
-              <w:t>Mural, sugestões, enquetes, comentários moderados.</w:t>
+              <w:t>Rede Social Germinare, sugestões, enquetes, comentários moderados.</w:t>
             </w:r>
           </w:p>
         </w:tc>
@@ -16601,7 +16763,7 @@
               <w:rPr>
                 <w:sz w:val="16"/>
               </w:rPr>
-              <w:t>Mural/comunidade</w:t>
+              <w:t>Rede Social Germinare/mural</w:t>
             </w:r>
           </w:p>
         </w:tc>

</xml_diff>

<commit_message>
docs(auth): define institutional access requirements (#20)
</commit_message>
<xml_diff>
--- a/docs/specs/Germinatura_Especificacao_Funcional_Tecnica_v2.2.docx
+++ b/docs/specs/Germinatura_Especificacao_Funcional_Tecnica_v2.2.docx
@@ -158,7 +158,7 @@
           </w:tcPr>
           <w:p>
             <w:r>
-              <w:t>2.2 - especificação-alvo revisada</w:t>
+              <w:t>2.2 - especificação-alvo com revisão de acesso institucional</w:t>
             </w:r>
           </w:p>
         </w:tc>
@@ -200,7 +200,7 @@
           </w:tcPr>
           <w:p>
             <w:r>
-              <w:t>25/08/2026</w:t>
+              <w:t>30/08/2026</w:t>
             </w:r>
           </w:p>
         </w:tc>
@@ -775,6 +775,48 @@
           </w:p>
         </w:tc>
       </w:tr>
+      <w:tr>
+        <w:tc>
+          <w:tcPr>
+            <w:tcW w:type="dxa" w:w="2541"/>
+          </w:tcPr>
+          <w:p>
+            <w:r>
+              <w:t>2.2.1</w:t>
+            </w:r>
+          </w:p>
+        </w:tc>
+        <w:tc>
+          <w:tcPr>
+            <w:tcW w:type="dxa" w:w="2541"/>
+          </w:tcPr>
+          <w:p>
+            <w:r>
+              <w:t>30/08/2026</w:t>
+            </w:r>
+          </w:p>
+        </w:tc>
+        <w:tc>
+          <w:tcPr>
+            <w:tcW w:type="dxa" w:w="2541"/>
+          </w:tcPr>
+          <w:p>
+            <w:r>
+              <w:t>Acesso institucional</w:t>
+            </w:r>
+          </w:p>
+        </w:tc>
+        <w:tc>
+          <w:tcPr>
+            <w:tcW w:type="dxa" w:w="2541"/>
+          </w:tcPr>
+          <w:p>
+            <w:r>
+              <w:t>Define ingresso no Portal por código enviado ao domínio institutojef.org.br, papéis cumulativos, ativação administrativa do vendedor e bootstrap seguro do primeiro administrador.</w:t>
+            </w:r>
+          </w:p>
+        </w:tc>
+      </w:tr>
     </w:tbl>
     <w:p>
       <w:pPr>
@@ -1399,13 +1441,13 @@
         <w:br/>
         <w:t>├── Eventos e campanhas</w:t>
         <w:br/>
-        <w:t>├── Comunidade / Mural</w:t>
+        <w:t>├── Rede Social Germinare / Mural</w:t>
         <w:br/>
         <w:t>├── Notificações</w:t>
         <w:br/>
         <w:t>├── Minha conta</w:t>
         <w:br/>
-        <w:t>├── Entrar / Cadastro</w:t>
+        <w:t>├── Entrar com código institucional / Cadastro</w:t>
         <w:br/>
         <w:t>├── Abrir PDV (quando autorizado)</w:t>
         <w:br/>
@@ -1437,7 +1479,7 @@
         <w:br/>
         <w:t xml:space="preserve">    ├── Comunicação e divulgação</w:t>
         <w:br/>
-        <w:t xml:space="preserve">    ├── Comunidade / Moderação</w:t>
+        <w:t xml:space="preserve">    ├── Rede Social Germinare / Moderação</w:t>
         <w:br/>
         <w:t xml:space="preserve">    ├── Notificações</w:t>
         <w:br/>
@@ -1963,6 +2005,38 @@
     </w:p>
     <w:p>
       <w:pPr>
+        <w:pStyle w:val="ListBullet"/>
+      </w:pPr>
+      <w:r>
+        <w:t>Qualquer pessoa que comprove controle de um endereço no domínio exato @institutojef.org.br poderá autenticar-se no Portal por código de uso único enviado ao próprio e-mail; domínios externos, subdomínios e grafias semelhantes serão rejeitados.</w:t>
+      </w:r>
+    </w:p>
+    <w:p>
+      <w:pPr>
+        <w:pStyle w:val="ListBullet"/>
+      </w:pPr>
+      <w:r>
+        <w:t>A primeira autenticação institucional válida concede somente o papel base CONSUMIDOR. A mesma identidade poderá acumular outros papéis, sem duplicação de conta.</w:t>
+      </w:r>
+    </w:p>
+    <w:p>
+      <w:pPr>
+        <w:pStyle w:val="ListBullet"/>
+      </w:pPr>
+      <w:r>
+        <w:t>O domínio institucional, isoladamente, não concede acesso ao PDV. O papel VENDEDOR e a permissão de venda presencial exigem ativação explícita e auditada por administrador.</w:t>
+      </w:r>
+    </w:p>
+    <w:p>
+      <w:pPr>
+        <w:pStyle w:val="ListBullet"/>
+      </w:pPr>
+      <w:r>
+        <w:t>O bootstrap greenfield define theo.martins@institutojef.org.br como primeiro administrador, após verificação do endereço, por operação única, idempotente e auditada, sem senha, código ou segredo versionado.</w:t>
+      </w:r>
+    </w:p>
+    <w:p>
+      <w:pPr>
         <w:pStyle w:val="Heading2"/>
         <w:widowControl/>
         <w:keepNext/>
@@ -2855,15 +2929,15 @@
         <w:keepNext/>
       </w:pPr>
       <w:r>
-        <w:t>4.6 Aba Comunidade / Mural</w:t>
-      </w:r>
-    </w:p>
-    <w:p>
-      <w:pPr>
-        <w:widowControl/>
-      </w:pPr>
-      <w:r>
-        <w:t>A primeira versão deve ser um mural moderado, e não um chat aberto. Isso reduz complexidade, spam e risco de moderação. Chats simultâneos poderão ser adicionados em fase posterior se houver uso comprovado.</w:t>
+        <w:t>4.6 Aba Rede Social Germinare / Mural</w:t>
+      </w:r>
+    </w:p>
+    <w:p>
+      <w:pPr>
+        <w:widowControl/>
+      </w:pPr>
+      <w:r>
+        <w:t>A Rede Social Germinare deve começar como um mural moderado, e não um chat aberto. Isso reduz complexidade, spam e risco de moderação. Chats simultâneos poderão ser adicionados em fase posterior se houver uso comprovado.</w:t>
       </w:r>
     </w:p>
     <w:p>
@@ -2948,6 +3022,14 @@
     </w:p>
     <w:p>
       <w:pPr>
+        <w:pStyle w:val="ListBullet"/>
+      </w:pPr>
+      <w:r>
+        <w:t>A Rede Social Germinare e as demais funcionalidades autenticadas do Portal estarão disponíveis a identidades verificadas do domínio @institutojef.org.br, respeitando flags, moderação e permissões específicas.</w:t>
+      </w:r>
+    </w:p>
+    <w:p>
+      <w:pPr>
         <w:pStyle w:val="Heading3"/>
         <w:widowControl/>
         <w:keepNext/>
@@ -3064,6 +3146,22 @@
       </w:pPr>
       <w:r>
         <w:t>Para vendedor: atalho para PDV e visão de responsabilidades pendentes.</w:t>
+      </w:r>
+    </w:p>
+    <w:p>
+      <w:pPr>
+        <w:pStyle w:val="ListBullet"/>
+      </w:pPr>
+      <w:r>
+        <w:t>Entrada e cadastro por código de uso único enviado ao e-mail institucional @institutojef.org.br; o código deve expirar, ser de uso único e não pode ser registrado em logs.</w:t>
+      </w:r>
+    </w:p>
+    <w:p>
+      <w:pPr>
+        <w:pStyle w:val="ListBullet"/>
+      </w:pPr>
+      <w:r>
+        <w:t>Uma conta exibe seus papéis cumulativos, mas o atalho do PDV somente aparece quando VENDEDOR e a permissão aplicável estiverem ativos.</w:t>
       </w:r>
     </w:p>
     <w:p>
@@ -5652,6 +5750,22 @@
     </w:p>
     <w:p>
       <w:pPr>
+        <w:pStyle w:val="ListBullet"/>
+      </w:pPr>
+      <w:r>
+        <w:t>Ativação e remoção do papel VENDEDOR devem ser ações administrativas explícitas, com confirmação das consequências e registro em audit log.</w:t>
+      </w:r>
+    </w:p>
+    <w:p>
+      <w:pPr>
+        <w:pStyle w:val="ListBullet"/>
+      </w:pPr>
+      <w:r>
+        <w:t>O primeiro ADMIN é reservado a theo.martins@institutojef.org.br por bootstrap único; depois da primeira concessão válida, novos administradores seguem exclusivamente o fluxo normal de permissões.</w:t>
+      </w:r>
+    </w:p>
+    <w:p>
+      <w:pPr>
         <w:pStyle w:val="Heading3"/>
         <w:widowControl/>
         <w:keepNext/>
@@ -5735,7 +5849,7 @@
         <w:keepNext/>
       </w:pPr>
       <w:r>
-        <w:t>5.14 Comunidade / Moderação</w:t>
+        <w:t>5.14 Rede Social Germinare / Moderação</w:t>
       </w:r>
     </w:p>
     <w:p>
@@ -6038,6 +6152,14 @@
       </w:pPr>
       <w:r>
         <w:t>A identidade operacional do vendedor no Germinatura é separada da identidade financeira do PicPay. Conta, KYC e credenciais do PicPay Empresas pertencem ao CNPJ e ao representante legal adulto; vendedores não recebem credenciais financeiras. O PicPay Tap, quando usado, respeita as permissões do aplicativo e não será tratado como solução distribuída para todos os vendedores enquanto estiver restrito ao usuário principal.</w:t>
+      </w:r>
+    </w:p>
+    <w:p>
+      <w:pPr>
+        <w:pStyle w:val="ListBullet"/>
+      </w:pPr>
+      <w:r>
+        <w:t>Possuir e verificar um e-mail @institutojef.org.br habilita somente o Portal como CONSUMIDOR. O PDV deve continuar negando acesso direto à interface e às APIs até que um administrador ative VENDEDOR e a permissão de venda presencial para a mesma identidade.</w:t>
       </w:r>
     </w:p>
     <w:p>
@@ -11993,6 +12115,30 @@
     </w:p>
     <w:p>
       <w:pPr>
+        <w:pStyle w:val="ListBullet"/>
+      </w:pPr>
+      <w:r>
+        <w:t>O ingresso institucional usa código de uso único enviado ao endereço verificado do domínio canônico institutojef.org.br. A comparação deve usar o e-mail normalizado informado pelo provedor, nunca apenas validação visual no cliente ou correspondência insegura por sufixo.</w:t>
+      </w:r>
+    </w:p>
+    <w:p>
+      <w:pPr>
+        <w:pStyle w:val="ListBullet"/>
+      </w:pPr>
+      <w:r>
+        <w:t>Solicitação e validação de código devem ter expiração, proteção contra replay, rate limit e respostas que não facilitem enumeração de contas.</w:t>
+      </w:r>
+    </w:p>
+    <w:p>
+      <w:pPr>
+        <w:pStyle w:val="ListBullet"/>
+      </w:pPr>
+      <w:r>
+        <w:t>Código de verificação, token e segredo nunca são persistidos em texto claro na aplicação, expostos em resposta ou registrados em log/auditoria.</w:t>
+      </w:r>
+    </w:p>
+    <w:p>
+      <w:pPr>
         <w:pStyle w:val="Heading3"/>
         <w:widowControl/>
         <w:keepNext/>
@@ -12049,6 +12195,22 @@
       </w:pPr>
       <w:r>
         <w:t>Princípio de menor privilégio.</w:t>
+      </w:r>
+    </w:p>
+    <w:p>
+      <w:pPr>
+        <w:pStyle w:val="ListBullet"/>
+      </w:pPr>
+      <w:r>
+        <w:t>A conta institucional recebe somente CONSUMIDOR por padrão e pode acumular papéis; toda elevação, inclusive VENDEDOR e ADMIN, é verificada no servidor, registrada e revogável.</w:t>
+      </w:r>
+    </w:p>
+    <w:p>
+      <w:pPr>
+        <w:pStyle w:val="ListBullet"/>
+      </w:pPr>
+      <w:r>
+        <w:t>O bootstrap de theo.martins@institutojef.org.br deve exigir endereço verificado, ser idempotente e tornar-se indisponível após a primeira concessão administrativa válida.</w:t>
       </w:r>
     </w:p>
     <w:p>
@@ -15493,7 +15655,7 @@
               <w:rPr>
                 <w:sz w:val="16"/>
               </w:rPr>
-              <w:t>Mural, sugestões, enquetes, comentários moderados.</w:t>
+              <w:t>Rede Social Germinare, sugestões, enquetes, comentários moderados.</w:t>
             </w:r>
           </w:p>
         </w:tc>
@@ -16601,7 +16763,7 @@
               <w:rPr>
                 <w:sz w:val="16"/>
               </w:rPr>
-              <w:t>Mural/comunidade</w:t>
+              <w:t>Rede Social Germinare/mural</w:t>
             </w:r>
           </w:p>
         </w:tc>

</xml_diff>

<commit_message>
docs(auth): sync institutional access to develop (#21)
</commit_message>
<xml_diff>
--- a/docs/specs/Germinatura_Especificacao_Funcional_Tecnica_v2.2.docx
+++ b/docs/specs/Germinatura_Especificacao_Funcional_Tecnica_v2.2.docx
@@ -158,7 +158,7 @@
           </w:tcPr>
           <w:p>
             <w:r>
-              <w:t>2.2 - especificação-alvo revisada</w:t>
+              <w:t>2.2 - especificação-alvo com revisão de acesso institucional</w:t>
             </w:r>
           </w:p>
         </w:tc>
@@ -200,7 +200,7 @@
           </w:tcPr>
           <w:p>
             <w:r>
-              <w:t>25/08/2026</w:t>
+              <w:t>30/08/2026</w:t>
             </w:r>
           </w:p>
         </w:tc>
@@ -775,6 +775,48 @@
           </w:p>
         </w:tc>
       </w:tr>
+      <w:tr>
+        <w:tc>
+          <w:tcPr>
+            <w:tcW w:type="dxa" w:w="2541"/>
+          </w:tcPr>
+          <w:p>
+            <w:r>
+              <w:t>2.2.1</w:t>
+            </w:r>
+          </w:p>
+        </w:tc>
+        <w:tc>
+          <w:tcPr>
+            <w:tcW w:type="dxa" w:w="2541"/>
+          </w:tcPr>
+          <w:p>
+            <w:r>
+              <w:t>30/08/2026</w:t>
+            </w:r>
+          </w:p>
+        </w:tc>
+        <w:tc>
+          <w:tcPr>
+            <w:tcW w:type="dxa" w:w="2541"/>
+          </w:tcPr>
+          <w:p>
+            <w:r>
+              <w:t>Acesso institucional</w:t>
+            </w:r>
+          </w:p>
+        </w:tc>
+        <w:tc>
+          <w:tcPr>
+            <w:tcW w:type="dxa" w:w="2541"/>
+          </w:tcPr>
+          <w:p>
+            <w:r>
+              <w:t>Define ingresso no Portal por código enviado ao domínio institutojef.org.br, papéis cumulativos, ativação administrativa do vendedor e bootstrap seguro do primeiro administrador.</w:t>
+            </w:r>
+          </w:p>
+        </w:tc>
+      </w:tr>
     </w:tbl>
     <w:p>
       <w:pPr>
@@ -1399,13 +1441,13 @@
         <w:br/>
         <w:t>├── Eventos e campanhas</w:t>
         <w:br/>
-        <w:t>├── Comunidade / Mural</w:t>
+        <w:t>├── Rede Social Germinare / Mural</w:t>
         <w:br/>
         <w:t>├── Notificações</w:t>
         <w:br/>
         <w:t>├── Minha conta</w:t>
         <w:br/>
-        <w:t>├── Entrar / Cadastro</w:t>
+        <w:t>├── Entrar com código institucional / Cadastro</w:t>
         <w:br/>
         <w:t>├── Abrir PDV (quando autorizado)</w:t>
         <w:br/>
@@ -1437,7 +1479,7 @@
         <w:br/>
         <w:t xml:space="preserve">    ├── Comunicação e divulgação</w:t>
         <w:br/>
-        <w:t xml:space="preserve">    ├── Comunidade / Moderação</w:t>
+        <w:t xml:space="preserve">    ├── Rede Social Germinare / Moderação</w:t>
         <w:br/>
         <w:t xml:space="preserve">    ├── Notificações</w:t>
         <w:br/>
@@ -1963,6 +2005,38 @@
     </w:p>
     <w:p>
       <w:pPr>
+        <w:pStyle w:val="ListBullet"/>
+      </w:pPr>
+      <w:r>
+        <w:t>Qualquer pessoa que comprove controle de um endereço no domínio exato @institutojef.org.br poderá autenticar-se no Portal por código de uso único enviado ao próprio e-mail; domínios externos, subdomínios e grafias semelhantes serão rejeitados.</w:t>
+      </w:r>
+    </w:p>
+    <w:p>
+      <w:pPr>
+        <w:pStyle w:val="ListBullet"/>
+      </w:pPr>
+      <w:r>
+        <w:t>A primeira autenticação institucional válida concede somente o papel base CONSUMIDOR. A mesma identidade poderá acumular outros papéis, sem duplicação de conta.</w:t>
+      </w:r>
+    </w:p>
+    <w:p>
+      <w:pPr>
+        <w:pStyle w:val="ListBullet"/>
+      </w:pPr>
+      <w:r>
+        <w:t>O domínio institucional, isoladamente, não concede acesso ao PDV. O papel VENDEDOR e a permissão de venda presencial exigem ativação explícita e auditada por administrador.</w:t>
+      </w:r>
+    </w:p>
+    <w:p>
+      <w:pPr>
+        <w:pStyle w:val="ListBullet"/>
+      </w:pPr>
+      <w:r>
+        <w:t>O bootstrap greenfield define theo.martins@institutojef.org.br como primeiro administrador, após verificação do endereço, por operação única, idempotente e auditada, sem senha, código ou segredo versionado.</w:t>
+      </w:r>
+    </w:p>
+    <w:p>
+      <w:pPr>
         <w:pStyle w:val="Heading2"/>
         <w:widowControl/>
         <w:keepNext/>
@@ -2855,15 +2929,15 @@
         <w:keepNext/>
       </w:pPr>
       <w:r>
-        <w:t>4.6 Aba Comunidade / Mural</w:t>
-      </w:r>
-    </w:p>
-    <w:p>
-      <w:pPr>
-        <w:widowControl/>
-      </w:pPr>
-      <w:r>
-        <w:t>A primeira versão deve ser um mural moderado, e não um chat aberto. Isso reduz complexidade, spam e risco de moderação. Chats simultâneos poderão ser adicionados em fase posterior se houver uso comprovado.</w:t>
+        <w:t>4.6 Aba Rede Social Germinare / Mural</w:t>
+      </w:r>
+    </w:p>
+    <w:p>
+      <w:pPr>
+        <w:widowControl/>
+      </w:pPr>
+      <w:r>
+        <w:t>A Rede Social Germinare deve começar como um mural moderado, e não um chat aberto. Isso reduz complexidade, spam e risco de moderação. Chats simultâneos poderão ser adicionados em fase posterior se houver uso comprovado.</w:t>
       </w:r>
     </w:p>
     <w:p>
@@ -2948,6 +3022,14 @@
     </w:p>
     <w:p>
       <w:pPr>
+        <w:pStyle w:val="ListBullet"/>
+      </w:pPr>
+      <w:r>
+        <w:t>A Rede Social Germinare e as demais funcionalidades autenticadas do Portal estarão disponíveis a identidades verificadas do domínio @institutojef.org.br, respeitando flags, moderação e permissões específicas.</w:t>
+      </w:r>
+    </w:p>
+    <w:p>
+      <w:pPr>
         <w:pStyle w:val="Heading3"/>
         <w:widowControl/>
         <w:keepNext/>
@@ -3064,6 +3146,22 @@
       </w:pPr>
       <w:r>
         <w:t>Para vendedor: atalho para PDV e visão de responsabilidades pendentes.</w:t>
+      </w:r>
+    </w:p>
+    <w:p>
+      <w:pPr>
+        <w:pStyle w:val="ListBullet"/>
+      </w:pPr>
+      <w:r>
+        <w:t>Entrada e cadastro por código de uso único enviado ao e-mail institucional @institutojef.org.br; o código deve expirar, ser de uso único e não pode ser registrado em logs.</w:t>
+      </w:r>
+    </w:p>
+    <w:p>
+      <w:pPr>
+        <w:pStyle w:val="ListBullet"/>
+      </w:pPr>
+      <w:r>
+        <w:t>Uma conta exibe seus papéis cumulativos, mas o atalho do PDV somente aparece quando VENDEDOR e a permissão aplicável estiverem ativos.</w:t>
       </w:r>
     </w:p>
     <w:p>
@@ -5652,6 +5750,22 @@
     </w:p>
     <w:p>
       <w:pPr>
+        <w:pStyle w:val="ListBullet"/>
+      </w:pPr>
+      <w:r>
+        <w:t>Ativação e remoção do papel VENDEDOR devem ser ações administrativas explícitas, com confirmação das consequências e registro em audit log.</w:t>
+      </w:r>
+    </w:p>
+    <w:p>
+      <w:pPr>
+        <w:pStyle w:val="ListBullet"/>
+      </w:pPr>
+      <w:r>
+        <w:t>O primeiro ADMIN é reservado a theo.martins@institutojef.org.br por bootstrap único; depois da primeira concessão válida, novos administradores seguem exclusivamente o fluxo normal de permissões.</w:t>
+      </w:r>
+    </w:p>
+    <w:p>
+      <w:pPr>
         <w:pStyle w:val="Heading3"/>
         <w:widowControl/>
         <w:keepNext/>
@@ -5735,7 +5849,7 @@
         <w:keepNext/>
       </w:pPr>
       <w:r>
-        <w:t>5.14 Comunidade / Moderação</w:t>
+        <w:t>5.14 Rede Social Germinare / Moderação</w:t>
       </w:r>
     </w:p>
     <w:p>
@@ -6038,6 +6152,14 @@
       </w:pPr>
       <w:r>
         <w:t>A identidade operacional do vendedor no Germinatura é separada da identidade financeira do PicPay. Conta, KYC e credenciais do PicPay Empresas pertencem ao CNPJ e ao representante legal adulto; vendedores não recebem credenciais financeiras. O PicPay Tap, quando usado, respeita as permissões do aplicativo e não será tratado como solução distribuída para todos os vendedores enquanto estiver restrito ao usuário principal.</w:t>
+      </w:r>
+    </w:p>
+    <w:p>
+      <w:pPr>
+        <w:pStyle w:val="ListBullet"/>
+      </w:pPr>
+      <w:r>
+        <w:t>Possuir e verificar um e-mail @institutojef.org.br habilita somente o Portal como CONSUMIDOR. O PDV deve continuar negando acesso direto à interface e às APIs até que um administrador ative VENDEDOR e a permissão de venda presencial para a mesma identidade.</w:t>
       </w:r>
     </w:p>
     <w:p>
@@ -11993,6 +12115,30 @@
     </w:p>
     <w:p>
       <w:pPr>
+        <w:pStyle w:val="ListBullet"/>
+      </w:pPr>
+      <w:r>
+        <w:t>O ingresso institucional usa código de uso único enviado ao endereço verificado do domínio canônico institutojef.org.br. A comparação deve usar o e-mail normalizado informado pelo provedor, nunca apenas validação visual no cliente ou correspondência insegura por sufixo.</w:t>
+      </w:r>
+    </w:p>
+    <w:p>
+      <w:pPr>
+        <w:pStyle w:val="ListBullet"/>
+      </w:pPr>
+      <w:r>
+        <w:t>Solicitação e validação de código devem ter expiração, proteção contra replay, rate limit e respostas que não facilitem enumeração de contas.</w:t>
+      </w:r>
+    </w:p>
+    <w:p>
+      <w:pPr>
+        <w:pStyle w:val="ListBullet"/>
+      </w:pPr>
+      <w:r>
+        <w:t>Código de verificação, token e segredo nunca são persistidos em texto claro na aplicação, expostos em resposta ou registrados em log/auditoria.</w:t>
+      </w:r>
+    </w:p>
+    <w:p>
+      <w:pPr>
         <w:pStyle w:val="Heading3"/>
         <w:widowControl/>
         <w:keepNext/>
@@ -12049,6 +12195,22 @@
       </w:pPr>
       <w:r>
         <w:t>Princípio de menor privilégio.</w:t>
+      </w:r>
+    </w:p>
+    <w:p>
+      <w:pPr>
+        <w:pStyle w:val="ListBullet"/>
+      </w:pPr>
+      <w:r>
+        <w:t>A conta institucional recebe somente CONSUMIDOR por padrão e pode acumular papéis; toda elevação, inclusive VENDEDOR e ADMIN, é verificada no servidor, registrada e revogável.</w:t>
+      </w:r>
+    </w:p>
+    <w:p>
+      <w:pPr>
+        <w:pStyle w:val="ListBullet"/>
+      </w:pPr>
+      <w:r>
+        <w:t>O bootstrap de theo.martins@institutojef.org.br deve exigir endereço verificado, ser idempotente e tornar-se indisponível após a primeira concessão administrativa válida.</w:t>
       </w:r>
     </w:p>
     <w:p>
@@ -15493,7 +15655,7 @@
               <w:rPr>
                 <w:sz w:val="16"/>
               </w:rPr>
-              <w:t>Mural, sugestões, enquetes, comentários moderados.</w:t>
+              <w:t>Rede Social Germinare, sugestões, enquetes, comentários moderados.</w:t>
             </w:r>
           </w:p>
         </w:tc>
@@ -16601,7 +16763,7 @@
               <w:rPr>
                 <w:sz w:val="16"/>
               </w:rPr>
-              <w:t>Mural/comunidade</w:t>
+              <w:t>Rede Social Germinare/mural</w:t>
             </w:r>
           </w:p>
         </w:tc>

</xml_diff>